<commit_message>
http node js concepts
</commit_message>
<xml_diff>
--- a/node-js/Event Loop.docx
+++ b/node-js/Event Loop.docx
@@ -48,10 +48,13 @@
     </w:p>
     <w:p>
       <w:r>
+        <w:rPr>
+          <w:noProof/>
+        </w:rPr>
         <w:drawing>
-          <wp:inline distT="0" distB="0" distL="0" distR="0" wp14:anchorId="0055B87C" wp14:editId="25657385">
-            <wp:extent cx="1143000" cy="952500"/>
-            <wp:effectExtent l="0" t="0" r="0" b="0"/>
+          <wp:inline distT="0" distB="0" distL="0" distR="0" wp14:anchorId="0055B87C" wp14:editId="482DC0F6">
+            <wp:extent cx="2319251" cy="1932709"/>
+            <wp:effectExtent l="0" t="0" r="5080" b="0"/>
             <wp:docPr id="1113695965" name="Picture 24" descr="NodeJS Event Loop - GeeksforGeeks"/>
             <wp:cNvGraphicFramePr>
               <a:graphicFrameLocks xmlns:a="http://schemas.openxmlformats.org/drawingml/2006/main" noChangeAspect="1"/>
@@ -81,7 +84,7 @@
                   <pic:spPr bwMode="auto">
                     <a:xfrm>
                       <a:off x="0" y="0"/>
-                      <a:ext cx="1143000" cy="952500"/>
+                      <a:ext cx="2320428" cy="1933690"/>
                     </a:xfrm>
                     <a:prstGeom prst="rect">
                       <a:avLst/>
@@ -265,7 +268,15 @@
         <w:t>Background APIs:</w:t>
       </w:r>
       <w:r>
-        <w:t xml:space="preserve"> Web APIs (in browsers) or background threads (in Node.js) that handle time-consuming tasks like network requests, file reading, or setTimeout timers.</w:t>
+        <w:t xml:space="preserve"> Web APIs (in browsers) or background threads (in Node.js) that handle time-consuming tasks like network requests, file reading, or </w:t>
+      </w:r>
+      <w:proofErr w:type="spellStart"/>
+      <w:r>
+        <w:t>setTimeout</w:t>
+      </w:r>
+      <w:proofErr w:type="spellEnd"/>
+      <w:r>
+        <w:t xml:space="preserve"> timers.</w:t>
       </w:r>
     </w:p>
     <w:p>
@@ -303,10 +314,12 @@
       <w:r>
         <w:t xml:space="preserve"> A higher-priority queue used for sensitive tasks like Promise resolutions and </w:t>
       </w:r>
+      <w:proofErr w:type="spellStart"/>
       <w:proofErr w:type="gramStart"/>
       <w:r>
         <w:t>process.nextTick</w:t>
       </w:r>
+      <w:proofErr w:type="spellEnd"/>
       <w:proofErr w:type="gramEnd"/>
       <w:r>
         <w:t>. [</w:t>
@@ -455,7 +468,16 @@
       </w:r>
       <w:proofErr w:type="gramEnd"/>
       <w:r>
-        <w:t xml:space="preserve"> is empty, the event loop immediately checks and executes all tasks in the </w:t>
+        <w:t xml:space="preserve"> is empty, the </w:t>
+      </w:r>
+      <w:r>
+        <w:rPr>
+          <w:highlight w:val="cyan"/>
+        </w:rPr>
+        <w:t>event loop</w:t>
+      </w:r>
+      <w:r>
+        <w:t xml:space="preserve"> immediately checks and executes all tasks in the </w:t>
       </w:r>
       <w:r>
         <w:rPr>
@@ -502,6 +524,7 @@
           <w:b/>
           <w:bCs/>
         </w:rPr>
+        <w:lastRenderedPageBreak/>
         <w:t>Run Macro-tasks:</w:t>
       </w:r>
       <w:r>
@@ -552,7 +575,6 @@
           <w:b/>
           <w:bCs/>
         </w:rPr>
-        <w:lastRenderedPageBreak/>
         <w:t>Repeat:</w:t>
       </w:r>
       <w:r>
@@ -610,6 +632,9 @@
     </w:p>
     <w:p>
       <w:r>
+        <w:rPr>
+          <w:noProof/>
+        </w:rPr>
         <w:drawing>
           <wp:inline distT="0" distB="0" distL="0" distR="0" wp14:anchorId="739313EF" wp14:editId="34D22F18">
             <wp:extent cx="3032760" cy="1699260"/>
@@ -703,6 +728,7 @@
       <w:r>
         <w:rPr>
           <w:rStyle w:val="Hyperlink"/>
+          <w:noProof/>
         </w:rPr>
         <w:drawing>
           <wp:inline distT="0" distB="0" distL="0" distR="0" wp14:anchorId="6C709C14" wp14:editId="22846451">
@@ -763,6 +789,7 @@
       <w:r>
         <w:rPr>
           <w:rStyle w:val="Hyperlink"/>
+          <w:noProof/>
         </w:rPr>
         <w:drawing>
           <wp:inline distT="0" distB="0" distL="0" distR="0" wp14:anchorId="372094D7" wp14:editId="07334489">
@@ -862,7 +889,17 @@
     </w:p>
     <w:p>
       <w:r>
-        <w:t>In a multi-threaded system, an app often relies on multiple threads waiting around for I/O operations to finish. The event loop eliminates the need for heavyweight multi-threading. Instead of freezing the thread while waiting for a file to load or a database to respond, the system offloads the task to the background, allowing the event loop to move on to execute other code. Once the background task is complete, its callback is queued and then executed. [</w:t>
+        <w:t xml:space="preserve">In a multi-threaded system, an app often relies on multiple threads waiting around for I/O operations to finish. The </w:t>
+      </w:r>
+      <w:r>
+        <w:rPr>
+          <w:highlight w:val="cyan"/>
+          <w:u w:val="single"/>
+        </w:rPr>
+        <w:t>event loop</w:t>
+      </w:r>
+      <w:r>
+        <w:t xml:space="preserve"> eliminates the need for heavyweight multi-threading. Instead of freezing the thread while waiting for a file to load or a database to respond, the system offloads the task to the background, allowing the event loop to move on to execute other code. Once the background task is complete, its callback is queued and then executed. [</w:t>
       </w:r>
       <w:hyperlink r:id="rId33" w:history="1">
         <w:r>
@@ -922,6 +959,7 @@
     </w:p>
     <w:p>
       <w:r>
+        <w:lastRenderedPageBreak/>
         <w:t xml:space="preserve">Would you like to explore </w:t>
       </w:r>
       <w:r>
@@ -996,6 +1034,9 @@
     </w:p>
     <w:p>
       <w:r>
+        <w:rPr>
+          <w:noProof/>
+        </w:rPr>
         <w:drawing>
           <wp:inline distT="0" distB="0" distL="0" distR="0" wp14:anchorId="77FAD365" wp14:editId="6A29FBF3">
             <wp:extent cx="190500" cy="190500"/>
@@ -1046,6 +1087,9 @@
         </w:drawing>
       </w:r>
       <w:r>
+        <w:rPr>
+          <w:noProof/>
+        </w:rPr>
         <w:drawing>
           <wp:inline distT="0" distB="0" distL="0" distR="0" wp14:anchorId="6C8CBAFB" wp14:editId="197B1695">
             <wp:extent cx="190500" cy="190500"/>
@@ -1096,6 +1140,9 @@
         </w:drawing>
       </w:r>
       <w:r>
+        <w:rPr>
+          <w:noProof/>
+        </w:rPr>
         <w:drawing>
           <wp:inline distT="0" distB="0" distL="0" distR="0" wp14:anchorId="6DEE2199" wp14:editId="3823DCF5">
             <wp:extent cx="190500" cy="190500"/>
@@ -1148,7 +1195,6 @@
     </w:p>
     <w:p>
       <w:r>
-        <w:lastRenderedPageBreak/>
         <w:t>23 sites</w:t>
       </w:r>
     </w:p>
@@ -1170,6 +1216,9 @@
     </w:p>
     <w:p>
       <w:r>
+        <w:rPr>
+          <w:noProof/>
+        </w:rPr>
         <w:drawing>
           <wp:inline distT="0" distB="0" distL="0" distR="0" wp14:anchorId="638BD281" wp14:editId="4FDC6A2A">
             <wp:extent cx="1341120" cy="746760"/>
@@ -1227,6 +1276,9 @@
     </w:p>
     <w:p>
       <w:r>
+        <w:rPr>
+          <w:noProof/>
+        </w:rPr>
         <w:drawing>
           <wp:inline distT="0" distB="0" distL="0" distR="0" wp14:anchorId="06179CAC" wp14:editId="5F83F73C">
             <wp:extent cx="152400" cy="152400"/>
@@ -1278,9 +1330,11 @@
       </w:r>
     </w:p>
     <w:p>
+      <w:proofErr w:type="spellStart"/>
       <w:r>
         <w:t>YouTube·JSConf</w:t>
       </w:r>
+      <w:proofErr w:type="spellEnd"/>
     </w:p>
     <w:p>
       <w:pPr>
@@ -1300,6 +1354,9 @@
     </w:p>
     <w:p>
       <w:r>
+        <w:rPr>
+          <w:noProof/>
+        </w:rPr>
         <w:drawing>
           <wp:inline distT="0" distB="0" distL="0" distR="0" wp14:anchorId="52E224FC" wp14:editId="15315B86">
             <wp:extent cx="152400" cy="152400"/>
@@ -1376,7 +1433,15 @@
       </w:r>
       <w:proofErr w:type="gramEnd"/>
       <w:r>
-        <w:t xml:space="preserve"> Loop? The event loop is what allows Node. js to perform non-blocking I/O operations — </w:t>
+        <w:t xml:space="preserve"> Loop? The event loop is what allows Node. </w:t>
+      </w:r>
+      <w:proofErr w:type="spellStart"/>
+      <w:r>
+        <w:t>js</w:t>
+      </w:r>
+      <w:proofErr w:type="spellEnd"/>
+      <w:r>
+        <w:t xml:space="preserve"> to perform non-blocking I/O operations — </w:t>
       </w:r>
       <w:proofErr w:type="gramStart"/>
       <w:r>
@@ -1384,11 +1449,22 @@
       </w:r>
       <w:proofErr w:type="gramEnd"/>
       <w:r>
-        <w:t xml:space="preserve"> a si...</w:t>
-      </w:r>
-    </w:p>
-    <w:p>
-      <w:r>
+        <w:t xml:space="preserve"> a </w:t>
+      </w:r>
+      <w:proofErr w:type="spellStart"/>
+      <w:r>
+        <w:t>si</w:t>
+      </w:r>
+      <w:proofErr w:type="spellEnd"/>
+      <w:r>
+        <w:t>...</w:t>
+      </w:r>
+    </w:p>
+    <w:p>
+      <w:r>
+        <w:rPr>
+          <w:noProof/>
+        </w:rPr>
         <w:drawing>
           <wp:inline distT="0" distB="0" distL="0" distR="0" wp14:anchorId="48B1C1B8" wp14:editId="3C21D97B">
             <wp:extent cx="784860" cy="784860"/>
@@ -1441,6 +1517,9 @@
     </w:p>
     <w:p>
       <w:r>
+        <w:rPr>
+          <w:noProof/>
+        </w:rPr>
         <w:drawing>
           <wp:inline distT="0" distB="0" distL="0" distR="0" wp14:anchorId="66619871" wp14:editId="18E4437F">
             <wp:extent cx="152400" cy="152400"/>
@@ -1503,6 +1582,7 @@
     </w:p>
     <w:p>
       <w:r>
+        <w:lastRenderedPageBreak/>
         <w:t>You said: sure</w:t>
       </w:r>
     </w:p>
@@ -1523,434 +1603,478 @@
     </w:p>
     <w:p>
       <w:r>
+        <w:t xml:space="preserve">Unlike browsers, Node.js uses the </w:t>
+      </w:r>
+      <w:proofErr w:type="spellStart"/>
+      <w:r>
+        <w:rPr>
+          <w:b/>
+          <w:bCs/>
+        </w:rPr>
+        <w:t>libuv</w:t>
+      </w:r>
+      <w:proofErr w:type="spellEnd"/>
+      <w:r>
+        <w:t xml:space="preserve"> C++ library to run its event loop. The loop splits macro-tasks into distinct, sequential phases. Each phase maintains its own queue of callbacks.</w:t>
+      </w:r>
+    </w:p>
+    <w:p>
+      <w:r>
+        <w:t xml:space="preserve">   ┌───────────────────────────┐</w:t>
+      </w:r>
+    </w:p>
+    <w:p>
+      <w:r>
+        <w:t xml:space="preserve">┌─&gt;│          Timers           │ ──&gt; Executes </w:t>
+      </w:r>
+      <w:proofErr w:type="spellStart"/>
+      <w:r>
+        <w:t>setTimeout</w:t>
+      </w:r>
+      <w:proofErr w:type="spellEnd"/>
+      <w:r>
+        <w:t xml:space="preserve"> / </w:t>
+      </w:r>
+      <w:proofErr w:type="spellStart"/>
+      <w:r>
+        <w:t>setInterval</w:t>
+      </w:r>
+      <w:proofErr w:type="spellEnd"/>
+    </w:p>
+    <w:p>
+      <w:r>
+        <w:t>│  └─────────────</w:t>
+      </w:r>
+      <w:r>
+        <w:rPr>
+          <w:rFonts w:ascii="MS Gothic" w:eastAsia="MS Gothic" w:hAnsi="MS Gothic" w:cs="MS Gothic" w:hint="eastAsia"/>
+        </w:rPr>
+        <w:t>┬</w:t>
+      </w:r>
+      <w:r>
+        <w:rPr>
+          <w:rFonts w:ascii="Aptos" w:hAnsi="Aptos" w:cs="Aptos"/>
+        </w:rPr>
+        <w:t>─────────────┘</w:t>
+      </w:r>
+    </w:p>
+    <w:p>
+      <w:r>
+        <w:t xml:space="preserve">│                </w:t>
+      </w:r>
+      <w:r>
+        <w:rPr>
+          <w:rFonts w:ascii="Arial" w:hAnsi="Arial" w:cs="Arial"/>
+        </w:rPr>
+        <w:t>▼</w:t>
+      </w:r>
+    </w:p>
+    <w:p>
+      <w:r>
+        <w:t>│  ┌───────────────────────────┐</w:t>
+      </w:r>
+    </w:p>
+    <w:p>
+      <w:proofErr w:type="gramStart"/>
+      <w:r>
+        <w:t>│  │</w:t>
+      </w:r>
+      <w:proofErr w:type="gramEnd"/>
+      <w:r>
+        <w:t xml:space="preserve">     Pending Callbacks     │ ──&gt; Executes deferred I/O errors/callbacks</w:t>
+      </w:r>
+    </w:p>
+    <w:p>
+      <w:r>
+        <w:t>│  └─────────────</w:t>
+      </w:r>
+      <w:r>
+        <w:rPr>
+          <w:rFonts w:ascii="MS Gothic" w:eastAsia="MS Gothic" w:hAnsi="MS Gothic" w:cs="MS Gothic" w:hint="eastAsia"/>
+        </w:rPr>
+        <w:t>┬</w:t>
+      </w:r>
+      <w:r>
+        <w:rPr>
+          <w:rFonts w:ascii="Aptos" w:hAnsi="Aptos" w:cs="Aptos"/>
+        </w:rPr>
+        <w:t>─────────────┘</w:t>
+      </w:r>
+    </w:p>
+    <w:p>
+      <w:r>
+        <w:t xml:space="preserve">│                </w:t>
+      </w:r>
+      <w:r>
+        <w:rPr>
+          <w:rFonts w:ascii="Arial" w:hAnsi="Arial" w:cs="Arial"/>
+        </w:rPr>
+        <w:t>▼</w:t>
+      </w:r>
+    </w:p>
+    <w:p>
+      <w:r>
+        <w:t>│  ┌───────────────────────────┐</w:t>
+      </w:r>
+    </w:p>
+    <w:p>
+      <w:proofErr w:type="gramStart"/>
+      <w:r>
+        <w:t>│  │</w:t>
+      </w:r>
+      <w:proofErr w:type="gramEnd"/>
+      <w:r>
+        <w:t xml:space="preserve">       Idle, </w:t>
+      </w:r>
+      <w:proofErr w:type="gramStart"/>
+      <w:r>
+        <w:t>Prepare</w:t>
+      </w:r>
+      <w:proofErr w:type="gramEnd"/>
+      <w:r>
+        <w:t xml:space="preserve">       │ ──&gt; Used internally by Node.js</w:t>
+      </w:r>
+    </w:p>
+    <w:p>
+      <w:r>
+        <w:t>│  └─────────────</w:t>
+      </w:r>
+      <w:r>
+        <w:rPr>
+          <w:rFonts w:ascii="MS Gothic" w:eastAsia="MS Gothic" w:hAnsi="MS Gothic" w:cs="MS Gothic" w:hint="eastAsia"/>
+        </w:rPr>
+        <w:t>┬</w:t>
+      </w:r>
+      <w:r>
+        <w:rPr>
+          <w:rFonts w:ascii="Aptos" w:hAnsi="Aptos" w:cs="Aptos"/>
+        </w:rPr>
+        <w:t>─────────────┘</w:t>
+      </w:r>
+    </w:p>
+    <w:p>
+      <w:r>
+        <w:t xml:space="preserve">│                </w:t>
+      </w:r>
+      <w:r>
+        <w:rPr>
+          <w:rFonts w:ascii="Arial" w:hAnsi="Arial" w:cs="Arial"/>
+        </w:rPr>
+        <w:t>▼</w:t>
+      </w:r>
+    </w:p>
+    <w:p>
+      <w:r>
+        <w:t>│  ┌───────────────────────────┐</w:t>
+      </w:r>
+    </w:p>
+    <w:p>
+      <w:proofErr w:type="gramStart"/>
+      <w:r>
+        <w:t>│  │</w:t>
+      </w:r>
+      <w:proofErr w:type="gramEnd"/>
+      <w:r>
+        <w:t xml:space="preserve">           Poll            │ ──&gt; Retrieves new I/O events; executes I/O code</w:t>
+      </w:r>
+    </w:p>
+    <w:p>
+      <w:r>
+        <w:t>│  └─────────────</w:t>
+      </w:r>
+      <w:r>
+        <w:rPr>
+          <w:rFonts w:ascii="MS Gothic" w:eastAsia="MS Gothic" w:hAnsi="MS Gothic" w:cs="MS Gothic" w:hint="eastAsia"/>
+        </w:rPr>
+        <w:t>┬</w:t>
+      </w:r>
+      <w:r>
+        <w:rPr>
+          <w:rFonts w:ascii="Aptos" w:hAnsi="Aptos" w:cs="Aptos"/>
+        </w:rPr>
+        <w:t>─────────────┘</w:t>
+      </w:r>
+    </w:p>
+    <w:p>
+      <w:r>
+        <w:t xml:space="preserve">│                </w:t>
+      </w:r>
+      <w:r>
+        <w:rPr>
+          <w:rFonts w:ascii="Arial" w:hAnsi="Arial" w:cs="Arial"/>
+        </w:rPr>
+        <w:t>▼</w:t>
+      </w:r>
+    </w:p>
+    <w:p>
+      <w:r>
+        <w:t>│  ┌───────────────────────────┐</w:t>
+      </w:r>
+    </w:p>
+    <w:p>
+      <w:proofErr w:type="gramStart"/>
+      <w:r>
+        <w:t>│  │</w:t>
+      </w:r>
+      <w:proofErr w:type="gramEnd"/>
+      <w:r>
+        <w:t xml:space="preserve">           Check           │ ──&gt; Executes </w:t>
+      </w:r>
+      <w:proofErr w:type="spellStart"/>
+      <w:r>
+        <w:t>setImmediate</w:t>
+      </w:r>
+      <w:proofErr w:type="spellEnd"/>
+      <w:r>
+        <w:t xml:space="preserve"> callbacks</w:t>
+      </w:r>
+    </w:p>
+    <w:p>
+      <w:r>
+        <w:t>│  └─────────────</w:t>
+      </w:r>
+      <w:r>
+        <w:rPr>
+          <w:rFonts w:ascii="MS Gothic" w:eastAsia="MS Gothic" w:hAnsi="MS Gothic" w:cs="MS Gothic" w:hint="eastAsia"/>
+        </w:rPr>
+        <w:t>┬</w:t>
+      </w:r>
+      <w:r>
+        <w:rPr>
+          <w:rFonts w:ascii="Aptos" w:hAnsi="Aptos" w:cs="Aptos"/>
+        </w:rPr>
+        <w:t>─────────────┘</w:t>
+      </w:r>
+    </w:p>
+    <w:p>
+      <w:r>
+        <w:t xml:space="preserve">│                </w:t>
+      </w:r>
+      <w:r>
+        <w:rPr>
+          <w:rFonts w:ascii="Arial" w:hAnsi="Arial" w:cs="Arial"/>
+        </w:rPr>
+        <w:t>▼</w:t>
+      </w:r>
+    </w:p>
+    <w:p>
+      <w:r>
+        <w:t>│  ┌───────────────────────────┐</w:t>
+      </w:r>
+    </w:p>
+    <w:p>
+      <w:r>
         <w:lastRenderedPageBreak/>
-        <w:t xml:space="preserve">Unlike browsers, Node.js uses the </w:t>
-      </w:r>
-      <w:r>
-        <w:rPr>
-          <w:b/>
-          <w:bCs/>
-        </w:rPr>
-        <w:t>libuv</w:t>
-      </w:r>
-      <w:r>
-        <w:t xml:space="preserve"> C++ library to run its event loop. The loop splits macro-tasks into distinct, sequential phases. Each phase maintains its own queue of callbacks.</w:t>
-      </w:r>
-    </w:p>
-    <w:p>
-      <w:r>
-        <w:t xml:space="preserve">   ┌───────────────────────────┐</w:t>
-      </w:r>
-    </w:p>
-    <w:p>
-      <w:r>
-        <w:t>┌─&gt;│          Timers           │ ──&gt; Executes setTimeout / setInterval</w:t>
-      </w:r>
-    </w:p>
-    <w:p>
-      <w:r>
-        <w:t>│  └─────────────</w:t>
-      </w:r>
-      <w:r>
-        <w:rPr>
-          <w:rFonts w:ascii="MS Gothic" w:eastAsia="MS Gothic" w:hAnsi="MS Gothic" w:cs="MS Gothic" w:hint="eastAsia"/>
-        </w:rPr>
-        <w:t>┬</w:t>
-      </w:r>
-      <w:r>
-        <w:rPr>
-          <w:rFonts w:ascii="Aptos" w:hAnsi="Aptos" w:cs="Aptos"/>
-        </w:rPr>
-        <w:t>─────────────┘</w:t>
-      </w:r>
-    </w:p>
-    <w:p>
-      <w:r>
-        <w:t xml:space="preserve">│                </w:t>
-      </w:r>
-      <w:r>
-        <w:rPr>
-          <w:rFonts w:ascii="Arial" w:hAnsi="Arial" w:cs="Arial"/>
-        </w:rPr>
-        <w:t>▼</w:t>
-      </w:r>
-    </w:p>
-    <w:p>
-      <w:r>
-        <w:t>│  ┌───────────────────────────┐</w:t>
-      </w:r>
-    </w:p>
-    <w:p>
+        <w:t>└─ │      Close Callbacks      │ ──&gt; Executes socket/handle close events</w:t>
+      </w:r>
+    </w:p>
+    <w:p>
+      <w:r>
+        <w:t xml:space="preserve">   └───────────────────────────┘</w:t>
+      </w:r>
+    </w:p>
+    <w:p>
+      <w:pPr>
+        <w:rPr>
+          <w:b/>
+          <w:bCs/>
+        </w:rPr>
+      </w:pPr>
+      <w:r>
+        <w:rPr>
+          <w:b/>
+          <w:bCs/>
+        </w:rPr>
+        <w:t>1. Timers</w:t>
+      </w:r>
+    </w:p>
+    <w:p>
+      <w:r>
+        <w:t xml:space="preserve">Executes callbacks scheduled by </w:t>
+      </w:r>
+      <w:proofErr w:type="spellStart"/>
       <w:proofErr w:type="gramStart"/>
       <w:r>
-        <w:t>│  │</w:t>
+        <w:t>setTimeout</w:t>
+      </w:r>
+      <w:proofErr w:type="spellEnd"/>
+      <w:r>
+        <w:t>(</w:t>
       </w:r>
       <w:proofErr w:type="gramEnd"/>
       <w:r>
-        <w:t xml:space="preserve">     Pending Callbacks     │ ──&gt; Executes deferred I/O errors/callbacks</w:t>
-      </w:r>
-    </w:p>
-    <w:p>
-      <w:r>
-        <w:t>│  └─────────────</w:t>
-      </w:r>
-      <w:r>
-        <w:rPr>
-          <w:rFonts w:ascii="MS Gothic" w:eastAsia="MS Gothic" w:hAnsi="MS Gothic" w:cs="MS Gothic" w:hint="eastAsia"/>
-        </w:rPr>
-        <w:t>┬</w:t>
-      </w:r>
-      <w:r>
-        <w:rPr>
-          <w:rFonts w:ascii="Aptos" w:hAnsi="Aptos" w:cs="Aptos"/>
-        </w:rPr>
-        <w:t>─────────────┘</w:t>
-      </w:r>
-    </w:p>
-    <w:p>
-      <w:r>
-        <w:t xml:space="preserve">│                </w:t>
-      </w:r>
-      <w:r>
-        <w:rPr>
-          <w:rFonts w:ascii="Arial" w:hAnsi="Arial" w:cs="Arial"/>
-        </w:rPr>
-        <w:t>▼</w:t>
-      </w:r>
-    </w:p>
-    <w:p>
-      <w:r>
-        <w:t>│  ┌───────────────────────────┐</w:t>
-      </w:r>
-    </w:p>
-    <w:p>
+        <w:t xml:space="preserve">) and </w:t>
+      </w:r>
+      <w:proofErr w:type="spellStart"/>
       <w:proofErr w:type="gramStart"/>
       <w:r>
-        <w:t>│  │</w:t>
+        <w:t>setInterval</w:t>
+      </w:r>
+      <w:proofErr w:type="spellEnd"/>
+      <w:r>
+        <w:t>(</w:t>
       </w:r>
       <w:proofErr w:type="gramEnd"/>
       <w:r>
-        <w:t xml:space="preserve">       Idle, </w:t>
+        <w:t>). The loop checks if the minimum threshold time has passed.</w:t>
+      </w:r>
+    </w:p>
+    <w:p>
+      <w:pPr>
+        <w:rPr>
+          <w:b/>
+          <w:bCs/>
+        </w:rPr>
+      </w:pPr>
+      <w:r>
+        <w:rPr>
+          <w:b/>
+          <w:bCs/>
+        </w:rPr>
+        <w:t>2. Pending Callbacks</w:t>
+      </w:r>
+    </w:p>
+    <w:p>
+      <w:r>
+        <w:t>Executes I/O callbacks deferred from the previous loop iteration. This includes system errors, like a TCP socket receiving an ECONNREFUSED error.</w:t>
+      </w:r>
+    </w:p>
+    <w:p>
+      <w:pPr>
+        <w:rPr>
+          <w:b/>
+          <w:bCs/>
+        </w:rPr>
+      </w:pPr>
+      <w:r>
+        <w:rPr>
+          <w:b/>
+          <w:bCs/>
+        </w:rPr>
+        <w:t>3. Idle, Prepare</w:t>
+      </w:r>
+    </w:p>
+    <w:p>
+      <w:r>
+        <w:t>Used only internally by Node.js for system optimization.</w:t>
+      </w:r>
+    </w:p>
+    <w:p>
+      <w:pPr>
+        <w:rPr>
+          <w:b/>
+          <w:bCs/>
+        </w:rPr>
+      </w:pPr>
+      <w:r>
+        <w:rPr>
+          <w:b/>
+          <w:bCs/>
+        </w:rPr>
+        <w:t>4. Poll</w:t>
+      </w:r>
+    </w:p>
+    <w:p>
+      <w:r>
+        <w:t xml:space="preserve">Retrieves new I/O events. Node.js blocks here to wait for incoming connections, data readings, or file systems updates. If the poll queue is empty, the loop will move to the next phase </w:t>
       </w:r>
       <w:proofErr w:type="gramStart"/>
       <w:r>
-        <w:t>Prepare</w:t>
-      </w:r>
+        <w:t xml:space="preserve">if </w:t>
+      </w:r>
+      <w:proofErr w:type="spellStart"/>
+      <w:r>
+        <w:t>setImmediate</w:t>
+      </w:r>
+      <w:proofErr w:type="spellEnd"/>
       <w:proofErr w:type="gramEnd"/>
       <w:r>
-        <w:t xml:space="preserve">       │ ──&gt; Used internally by Node.js</w:t>
-      </w:r>
-    </w:p>
-    <w:p>
-      <w:r>
-        <w:t>│  └─────────────</w:t>
-      </w:r>
-      <w:r>
-        <w:rPr>
-          <w:rFonts w:ascii="MS Gothic" w:eastAsia="MS Gothic" w:hAnsi="MS Gothic" w:cs="MS Gothic" w:hint="eastAsia"/>
-        </w:rPr>
-        <w:t>┬</w:t>
-      </w:r>
-      <w:r>
-        <w:rPr>
-          <w:rFonts w:ascii="Aptos" w:hAnsi="Aptos" w:cs="Aptos"/>
-        </w:rPr>
-        <w:t>─────────────┘</w:t>
-      </w:r>
-    </w:p>
-    <w:p>
-      <w:r>
-        <w:t xml:space="preserve">│                </w:t>
-      </w:r>
-      <w:r>
-        <w:rPr>
-          <w:rFonts w:ascii="Arial" w:hAnsi="Arial" w:cs="Arial"/>
-        </w:rPr>
-        <w:t>▼</w:t>
-      </w:r>
-    </w:p>
-    <w:p>
-      <w:r>
-        <w:t>│  ┌───────────────────────────┐</w:t>
-      </w:r>
-    </w:p>
-    <w:p>
+        <w:t xml:space="preserve"> is </w:t>
+      </w:r>
       <w:proofErr w:type="gramStart"/>
       <w:r>
-        <w:t>│  │</w:t>
+        <w:t>scheduled, or</w:t>
       </w:r>
       <w:proofErr w:type="gramEnd"/>
       <w:r>
-        <w:t xml:space="preserve">           Poll            │ ──&gt; Retrieves new I/O events; executes I/O code</w:t>
-      </w:r>
-    </w:p>
-    <w:p>
-      <w:r>
-        <w:t>│  └─────────────</w:t>
-      </w:r>
-      <w:r>
-        <w:rPr>
-          <w:rFonts w:ascii="MS Gothic" w:eastAsia="MS Gothic" w:hAnsi="MS Gothic" w:cs="MS Gothic" w:hint="eastAsia"/>
-        </w:rPr>
-        <w:t>┬</w:t>
-      </w:r>
-      <w:r>
-        <w:rPr>
-          <w:rFonts w:ascii="Aptos" w:hAnsi="Aptos" w:cs="Aptos"/>
-        </w:rPr>
-        <w:t>─────────────┘</w:t>
-      </w:r>
-    </w:p>
-    <w:p>
-      <w:r>
-        <w:t xml:space="preserve">│                </w:t>
-      </w:r>
-      <w:r>
-        <w:rPr>
-          <w:rFonts w:ascii="Arial" w:hAnsi="Arial" w:cs="Arial"/>
-        </w:rPr>
-        <w:t>▼</w:t>
-      </w:r>
-    </w:p>
-    <w:p>
-      <w:r>
-        <w:t>│  ┌───────────────────────────┐</w:t>
-      </w:r>
-    </w:p>
-    <w:p>
+        <w:t xml:space="preserve"> wait for timers to wrap up.</w:t>
+      </w:r>
+    </w:p>
+    <w:p>
+      <w:pPr>
+        <w:rPr>
+          <w:b/>
+          <w:bCs/>
+        </w:rPr>
+      </w:pPr>
+      <w:r>
+        <w:rPr>
+          <w:b/>
+          <w:bCs/>
+        </w:rPr>
+        <w:t>5. Check</w:t>
+      </w:r>
+    </w:p>
+    <w:p>
+      <w:r>
+        <w:t xml:space="preserve">Executes callbacks scheduled by </w:t>
+      </w:r>
+      <w:proofErr w:type="spellStart"/>
       <w:proofErr w:type="gramStart"/>
       <w:r>
-        <w:t>│  │</w:t>
+        <w:t>setImmediate</w:t>
+      </w:r>
+      <w:proofErr w:type="spellEnd"/>
+      <w:r>
+        <w:t>(</w:t>
       </w:r>
       <w:proofErr w:type="gramEnd"/>
       <w:r>
-        <w:t xml:space="preserve">           Check           │ ──&gt; Executes setImmediate callbacks</w:t>
-      </w:r>
-    </w:p>
-    <w:p>
-      <w:r>
-        <w:t>│  └─────────────</w:t>
-      </w:r>
-      <w:r>
-        <w:rPr>
-          <w:rFonts w:ascii="MS Gothic" w:eastAsia="MS Gothic" w:hAnsi="MS Gothic" w:cs="MS Gothic" w:hint="eastAsia"/>
-        </w:rPr>
-        <w:t>┬</w:t>
-      </w:r>
-      <w:r>
-        <w:rPr>
-          <w:rFonts w:ascii="Aptos" w:hAnsi="Aptos" w:cs="Aptos"/>
-        </w:rPr>
-        <w:t>─────────────┘</w:t>
-      </w:r>
-    </w:p>
-    <w:p>
-      <w:r>
-        <w:t xml:space="preserve">│                </w:t>
-      </w:r>
-      <w:r>
-        <w:rPr>
-          <w:rFonts w:ascii="Arial" w:hAnsi="Arial" w:cs="Arial"/>
-        </w:rPr>
-        <w:t>▼</w:t>
-      </w:r>
-    </w:p>
-    <w:p>
-      <w:r>
-        <w:t>│  ┌───────────────────────────┐</w:t>
-      </w:r>
-    </w:p>
-    <w:p>
-      <w:r>
-        <w:t>└─ │      Close Callbacks      │ ──&gt; Executes socket/handle close events</w:t>
-      </w:r>
-    </w:p>
-    <w:p>
-      <w:r>
-        <w:t xml:space="preserve">   └───────────────────────────┘</w:t>
-      </w:r>
-    </w:p>
-    <w:p>
-      <w:pPr>
-        <w:rPr>
-          <w:b/>
-          <w:bCs/>
-        </w:rPr>
-      </w:pPr>
-      <w:r>
-        <w:rPr>
-          <w:b/>
-          <w:bCs/>
-        </w:rPr>
-        <w:lastRenderedPageBreak/>
-        <w:t>1. Timers</w:t>
-      </w:r>
-    </w:p>
-    <w:p>
-      <w:r>
-        <w:t xml:space="preserve">Executes callbacks scheduled by </w:t>
+        <w:t>). This phase allows developers to execute code immediately after the poll phase finishes.</w:t>
+      </w:r>
+    </w:p>
+    <w:p>
+      <w:pPr>
+        <w:rPr>
+          <w:b/>
+          <w:bCs/>
+        </w:rPr>
+      </w:pPr>
+      <w:r>
+        <w:rPr>
+          <w:b/>
+          <w:bCs/>
+        </w:rPr>
+        <w:t>6. Close Callbacks</w:t>
+      </w:r>
+    </w:p>
+    <w:p>
+      <w:r>
+        <w:t xml:space="preserve">Handles sudden </w:t>
       </w:r>
       <w:proofErr w:type="gramStart"/>
       <w:r>
-        <w:t>setTimeout(</w:t>
+        <w:t>socket</w:t>
       </w:r>
       <w:proofErr w:type="gramEnd"/>
       <w:r>
-        <w:t xml:space="preserve">) and </w:t>
-      </w:r>
+        <w:t xml:space="preserve"> or handle closures, such as </w:t>
+      </w:r>
+      <w:proofErr w:type="spellStart"/>
       <w:proofErr w:type="gramStart"/>
       <w:r>
-        <w:t>setInterval(</w:t>
-      </w:r>
+        <w:t>socket.on</w:t>
+      </w:r>
+      <w:proofErr w:type="spellEnd"/>
       <w:proofErr w:type="gramEnd"/>
       <w:r>
-        <w:t>). The loop checks if the minimum threshold time has passed.</w:t>
-      </w:r>
-    </w:p>
-    <w:p>
-      <w:pPr>
-        <w:rPr>
-          <w:b/>
-          <w:bCs/>
-        </w:rPr>
-      </w:pPr>
-      <w:r>
-        <w:rPr>
-          <w:b/>
-          <w:bCs/>
-        </w:rPr>
-        <w:t>2. Pending Callbacks</w:t>
-      </w:r>
-    </w:p>
-    <w:p>
-      <w:r>
-        <w:t>Executes I/O callbacks deferred from the previous loop iteration. This includes system errors, like a TCP socket receiving an ECONNREFUSED error.</w:t>
-      </w:r>
-    </w:p>
-    <w:p>
-      <w:pPr>
-        <w:rPr>
-          <w:b/>
-          <w:bCs/>
-        </w:rPr>
-      </w:pPr>
-      <w:r>
-        <w:rPr>
-          <w:b/>
-          <w:bCs/>
-        </w:rPr>
-        <w:t>3. Idle, Prepare</w:t>
-      </w:r>
-    </w:p>
-    <w:p>
-      <w:r>
-        <w:t>Used only internally by Node.js for system optimization.</w:t>
-      </w:r>
-    </w:p>
-    <w:p>
-      <w:pPr>
-        <w:rPr>
-          <w:b/>
-          <w:bCs/>
-        </w:rPr>
-      </w:pPr>
-      <w:r>
-        <w:rPr>
-          <w:b/>
-          <w:bCs/>
-        </w:rPr>
-        <w:t>4. Poll</w:t>
-      </w:r>
-    </w:p>
-    <w:p>
-      <w:r>
-        <w:t xml:space="preserve">Retrieves new I/O events. Node.js blocks here to wait for incoming connections, data readings, or file systems updates. If the poll queue is empty, the loop will move to the next phase </w:t>
-      </w:r>
-      <w:proofErr w:type="gramStart"/>
-      <w:r>
-        <w:t>if setImmediate</w:t>
-      </w:r>
-      <w:proofErr w:type="gramEnd"/>
-      <w:r>
-        <w:t xml:space="preserve"> is </w:t>
-      </w:r>
-      <w:proofErr w:type="gramStart"/>
-      <w:r>
-        <w:t>scheduled, or</w:t>
-      </w:r>
-      <w:proofErr w:type="gramEnd"/>
-      <w:r>
-        <w:t xml:space="preserve"> wait for timers to wrap up.</w:t>
-      </w:r>
-    </w:p>
-    <w:p>
-      <w:pPr>
-        <w:rPr>
-          <w:b/>
-          <w:bCs/>
-        </w:rPr>
-      </w:pPr>
-      <w:r>
-        <w:rPr>
-          <w:b/>
-          <w:bCs/>
-        </w:rPr>
-        <w:t>5. Check</w:t>
-      </w:r>
-    </w:p>
-    <w:p>
-      <w:r>
-        <w:t xml:space="preserve">Executes callbacks scheduled by </w:t>
-      </w:r>
-      <w:proofErr w:type="gramStart"/>
-      <w:r>
-        <w:t>setImmediate(</w:t>
-      </w:r>
-      <w:proofErr w:type="gramEnd"/>
-      <w:r>
-        <w:t>). This phase allows developers to execute code immediately after the poll phase finishes.</w:t>
-      </w:r>
-    </w:p>
-    <w:p>
-      <w:pPr>
-        <w:rPr>
-          <w:b/>
-          <w:bCs/>
-        </w:rPr>
-      </w:pPr>
-      <w:r>
-        <w:rPr>
-          <w:b/>
-          <w:bCs/>
-        </w:rPr>
-        <w:t>6. Close Callbacks</w:t>
-      </w:r>
-    </w:p>
-    <w:p>
-      <w:r>
-        <w:t xml:space="preserve">Handles sudden </w:t>
-      </w:r>
-      <w:proofErr w:type="gramStart"/>
-      <w:r>
-        <w:t>socket</w:t>
-      </w:r>
-      <w:proofErr w:type="gramEnd"/>
-      <w:r>
-        <w:t xml:space="preserve"> or handle closures, such as </w:t>
-      </w:r>
-      <w:proofErr w:type="gramStart"/>
-      <w:r>
-        <w:t>socket.on</w:t>
-      </w:r>
-      <w:proofErr w:type="gramEnd"/>
-      <w:r>
         <w:t>('close', ...).</w:t>
       </w:r>
     </w:p>
     <w:p>
       <w:r>
         <w:pict w14:anchorId="492216C5">
-          <v:rect id="_x0000_i1109" style="width:0;height:1.5pt" o:hralign="center" o:hrstd="t" o:hr="t" fillcolor="#a0a0a0" stroked="f"/>
+          <v:rect id="_x0000_i1025" style="width:0;height:1.5pt" o:hralign="center" o:hrstd="t" o:hr="t" fillcolor="#a0a0a0" stroked="f"/>
         </w:pict>
       </w:r>
     </w:p>
@@ -1991,6 +2115,7 @@
           <w:numId w:val="4"/>
         </w:numPr>
       </w:pPr>
+      <w:proofErr w:type="spellStart"/>
       <w:proofErr w:type="gramStart"/>
       <w:r>
         <w:rPr>
@@ -1999,6 +2124,7 @@
         </w:rPr>
         <w:t>process.nextTick</w:t>
       </w:r>
+      <w:proofErr w:type="spellEnd"/>
       <w:proofErr w:type="gramEnd"/>
       <w:r>
         <w:rPr>
@@ -2042,17 +2168,27 @@
       </w:r>
       <w:proofErr w:type="gramEnd"/>
       <w:r>
-        <w:t>(), and async/await resolutions right after the nextTick queue finishes.</w:t>
+        <w:t xml:space="preserve">(), and async/await resolutions right after the </w:t>
+      </w:r>
+      <w:proofErr w:type="spellStart"/>
+      <w:r>
+        <w:t>nextTick</w:t>
+      </w:r>
+      <w:proofErr w:type="spellEnd"/>
+      <w:r>
+        <w:t xml:space="preserve"> queue finishes.</w:t>
       </w:r>
     </w:p>
     <w:p>
       <w:r>
         <w:t xml:space="preserve">If you recursively call </w:t>
       </w:r>
+      <w:proofErr w:type="spellStart"/>
       <w:proofErr w:type="gramStart"/>
       <w:r>
         <w:t>process.nextTick</w:t>
       </w:r>
+      <w:proofErr w:type="spellEnd"/>
       <w:proofErr w:type="gramEnd"/>
       <w:r>
         <w:t>(), you will starve the event loop, freezing all file reads, network connections, and timers.</w:t>
@@ -2060,8 +2196,9 @@
     </w:p>
     <w:p>
       <w:r>
+        <w:lastRenderedPageBreak/>
         <w:pict w14:anchorId="3BD056BD">
-          <v:rect id="_x0000_i1110" style="width:0;height:1.5pt" o:hralign="center" o:hrstd="t" o:hr="t" fillcolor="#a0a0a0" stroked="f"/>
+          <v:rect id="_x0000_i1026" style="width:0;height:1.5pt" o:hralign="center" o:hrstd="t" o:hr="t" fillcolor="#a0a0a0" stroked="f"/>
         </w:pict>
       </w:r>
     </w:p>
@@ -2082,230 +2219,311 @@
     </w:p>
     <w:p>
       <w:r>
+        <w:t>Because Node.js relies on a single main thread, long-running CPU operations block the loop. This stops all other users from getting responses.</w:t>
+      </w:r>
+    </w:p>
+    <w:p>
+      <w:pPr>
+        <w:rPr>
+          <w:b/>
+          <w:bCs/>
+        </w:rPr>
+      </w:pPr>
+      <w:r>
+        <w:rPr>
+          <w:b/>
+          <w:bCs/>
+        </w:rPr>
+        <w:t>1. Offload Heavy Work to the Worker Pool</w:t>
+      </w:r>
+    </w:p>
+    <w:p>
+      <w:r>
+        <w:t>Node.js uses a background C++ thread pool (Worker Pool) for heavy built-in tasks like cryptography (crypto), compression (</w:t>
+      </w:r>
+      <w:proofErr w:type="spellStart"/>
+      <w:r>
+        <w:t>zlib</w:t>
+      </w:r>
+      <w:proofErr w:type="spellEnd"/>
+      <w:r>
+        <w:t>), and File System (fs) tasks.</w:t>
+      </w:r>
+    </w:p>
+    <w:p>
+      <w:pPr>
+        <w:rPr>
+          <w:b/>
+          <w:bCs/>
+        </w:rPr>
+      </w:pPr>
+      <w:r>
+        <w:rPr>
+          <w:b/>
+          <w:bCs/>
+        </w:rPr>
+        <w:t>2. Partition Big Tasks</w:t>
+      </w:r>
+    </w:p>
+    <w:p>
+      <w:r>
+        <w:t xml:space="preserve">If you must process a massive array on the main thread, chop it up using </w:t>
+      </w:r>
+      <w:proofErr w:type="spellStart"/>
+      <w:proofErr w:type="gramStart"/>
+      <w:r>
+        <w:t>setImmediate</w:t>
+      </w:r>
+      <w:proofErr w:type="spellEnd"/>
+      <w:r>
+        <w:t>(</w:t>
+      </w:r>
+      <w:proofErr w:type="gramEnd"/>
+      <w:r>
+        <w:t xml:space="preserve">). </w:t>
+      </w:r>
+      <w:proofErr w:type="gramStart"/>
+      <w:r>
+        <w:t>This yields</w:t>
+      </w:r>
+      <w:proofErr w:type="gramEnd"/>
+      <w:r>
+        <w:t xml:space="preserve"> control back to the event loop between chunks, allowing it to handle pending network requests.</w:t>
+      </w:r>
+    </w:p>
+    <w:p>
+      <w:proofErr w:type="spellStart"/>
+      <w:r>
+        <w:t>javascript</w:t>
+      </w:r>
+      <w:proofErr w:type="spellEnd"/>
+    </w:p>
+    <w:p>
+      <w:r>
+        <w:t>// Blocks the loop completely</w:t>
+      </w:r>
+    </w:p>
+    <w:p>
+      <w:r>
+        <w:t xml:space="preserve">function </w:t>
+      </w:r>
+      <w:proofErr w:type="spellStart"/>
+      <w:r>
+        <w:t>blockLoop</w:t>
+      </w:r>
+      <w:proofErr w:type="spellEnd"/>
+      <w:r>
+        <w:t>(</w:t>
+      </w:r>
+      <w:proofErr w:type="gramStart"/>
+      <w:r>
+        <w:t>array) {</w:t>
+      </w:r>
+      <w:proofErr w:type="gramEnd"/>
+    </w:p>
+    <w:p>
+      <w:r>
+        <w:t xml:space="preserve">  for (let item of </w:t>
+      </w:r>
+      <w:proofErr w:type="gramStart"/>
+      <w:r>
+        <w:t>array) {</w:t>
+      </w:r>
+      <w:proofErr w:type="gramEnd"/>
+    </w:p>
+    <w:p>
+      <w:r>
+        <w:t xml:space="preserve">    </w:t>
+      </w:r>
+      <w:proofErr w:type="spellStart"/>
+      <w:r>
+        <w:t>heavyCalculation</w:t>
+      </w:r>
+      <w:proofErr w:type="spellEnd"/>
+      <w:r>
+        <w:t xml:space="preserve">(item); </w:t>
+      </w:r>
+    </w:p>
+    <w:p>
+      <w:r>
+        <w:t xml:space="preserve">  }</w:t>
+      </w:r>
+    </w:p>
+    <w:p>
+      <w:r>
+        <w:t>}</w:t>
+      </w:r>
+    </w:p>
+    <w:p/>
+    <w:p>
+      <w:r>
+        <w:t>// Non-blocking: Partitions work and yields control</w:t>
+      </w:r>
+    </w:p>
+    <w:p>
+      <w:r>
+        <w:t xml:space="preserve">function </w:t>
+      </w:r>
+      <w:proofErr w:type="spellStart"/>
+      <w:proofErr w:type="gramStart"/>
+      <w:r>
+        <w:t>safeProcess</w:t>
+      </w:r>
+      <w:proofErr w:type="spellEnd"/>
+      <w:r>
+        <w:t>(</w:t>
+      </w:r>
+      <w:proofErr w:type="gramEnd"/>
+      <w:r>
+        <w:t xml:space="preserve">array, index = </w:t>
+      </w:r>
+      <w:proofErr w:type="gramStart"/>
+      <w:r>
+        <w:t>0) {</w:t>
+      </w:r>
+      <w:proofErr w:type="gramEnd"/>
+    </w:p>
+    <w:p>
+      <w:r>
+        <w:t xml:space="preserve">  if (index &gt;= </w:t>
+      </w:r>
+      <w:proofErr w:type="spellStart"/>
+      <w:proofErr w:type="gramStart"/>
+      <w:r>
+        <w:t>array.length</w:t>
+      </w:r>
+      <w:proofErr w:type="spellEnd"/>
+      <w:proofErr w:type="gramEnd"/>
+      <w:r>
+        <w:t>) return;</w:t>
+      </w:r>
+    </w:p>
+    <w:p/>
+    <w:p>
+      <w:r>
+        <w:t xml:space="preserve">  </w:t>
+      </w:r>
+      <w:proofErr w:type="spellStart"/>
+      <w:r>
+        <w:t>heavyCalculation</w:t>
+      </w:r>
+      <w:proofErr w:type="spellEnd"/>
+      <w:r>
+        <w:t>(array[index]);</w:t>
+      </w:r>
+    </w:p>
+    <w:p/>
+    <w:p>
+      <w:r>
+        <w:t xml:space="preserve">  // Yields back to the event loop before processing the next item</w:t>
+      </w:r>
+    </w:p>
+    <w:p>
+      <w:r>
+        <w:t xml:space="preserve">  </w:t>
+      </w:r>
+      <w:proofErr w:type="spellStart"/>
+      <w:proofErr w:type="gramStart"/>
+      <w:r>
+        <w:t>setImmediate</w:t>
+      </w:r>
+      <w:proofErr w:type="spellEnd"/>
+      <w:r>
+        <w:t>(</w:t>
+      </w:r>
+      <w:proofErr w:type="gramEnd"/>
+      <w:r>
+        <w:t xml:space="preserve">() =&gt; </w:t>
+      </w:r>
+      <w:proofErr w:type="spellStart"/>
+      <w:proofErr w:type="gramStart"/>
+      <w:r>
+        <w:t>safeProcess</w:t>
+      </w:r>
+      <w:proofErr w:type="spellEnd"/>
+      <w:r>
+        <w:t>(</w:t>
+      </w:r>
+      <w:proofErr w:type="gramEnd"/>
+      <w:r>
+        <w:t>array, index + 1));</w:t>
+      </w:r>
+    </w:p>
+    <w:p>
+      <w:r>
         <w:lastRenderedPageBreak/>
-        <w:t>Because Node.js relies on a single main thread, long-running CPU operations block the loop. This stops all other users from getting responses.</w:t>
-      </w:r>
-    </w:p>
-    <w:p>
-      <w:pPr>
-        <w:rPr>
-          <w:b/>
-          <w:bCs/>
-        </w:rPr>
-      </w:pPr>
-      <w:r>
-        <w:rPr>
-          <w:b/>
-          <w:bCs/>
-        </w:rPr>
-        <w:t>1. Offload Heavy Work to the Worker Pool</w:t>
-      </w:r>
-    </w:p>
-    <w:p>
-      <w:r>
-        <w:t>Node.js uses a background C++ thread pool (Worker Pool) for heavy built-in tasks like cryptography (crypto), compression (zlib), and File System (fs) tasks.</w:t>
-      </w:r>
-    </w:p>
-    <w:p>
-      <w:pPr>
-        <w:rPr>
-          <w:b/>
-          <w:bCs/>
-        </w:rPr>
-      </w:pPr>
-      <w:r>
-        <w:rPr>
-          <w:b/>
-          <w:bCs/>
-        </w:rPr>
-        <w:t>2. Partition Big Tasks</w:t>
-      </w:r>
-    </w:p>
-    <w:p>
-      <w:r>
-        <w:t xml:space="preserve">If you must process a massive array on the main thread, chop it up using </w:t>
-      </w:r>
+        <w:t>}</w:t>
+      </w:r>
+    </w:p>
+    <w:p>
+      <w:r>
+        <w:t>Use code with caution.</w:t>
+      </w:r>
+    </w:p>
+    <w:p>
+      <w:pPr>
+        <w:rPr>
+          <w:b/>
+          <w:bCs/>
+        </w:rPr>
+      </w:pPr>
+      <w:r>
+        <w:rPr>
+          <w:b/>
+          <w:bCs/>
+        </w:rPr>
+        <w:t>3. Use Worker Threads</w:t>
+      </w:r>
+    </w:p>
+    <w:p>
+      <w:r>
+        <w:t xml:space="preserve">For heavy CPU mathematics or data analysis, spawn real background threads using the </w:t>
+      </w:r>
+      <w:proofErr w:type="spellStart"/>
+      <w:r>
+        <w:t>worker_threads</w:t>
+      </w:r>
+      <w:proofErr w:type="spellEnd"/>
+      <w:r>
+        <w:t xml:space="preserve"> module to execute tasks on separate CPU cores.</w:t>
+      </w:r>
+    </w:p>
+    <w:p>
+      <w:r>
+        <w:t xml:space="preserve">Would you like to look at a </w:t>
+      </w:r>
+      <w:r>
+        <w:rPr>
+          <w:b/>
+          <w:bCs/>
+        </w:rPr>
+        <w:t>code snippet quiz</w:t>
+      </w:r>
+      <w:r>
+        <w:t xml:space="preserve"> to test your knowledge on the exact print order of </w:t>
+      </w:r>
+      <w:proofErr w:type="spellStart"/>
+      <w:r>
+        <w:t>setTimeout</w:t>
+      </w:r>
+      <w:proofErr w:type="spellEnd"/>
+      <w:r>
+        <w:t xml:space="preserve">, </w:t>
+      </w:r>
+      <w:proofErr w:type="spellStart"/>
+      <w:r>
+        <w:t>setImmediate</w:t>
+      </w:r>
+      <w:proofErr w:type="spellEnd"/>
+      <w:r>
+        <w:t xml:space="preserve">, and </w:t>
+      </w:r>
+      <w:proofErr w:type="spellStart"/>
       <w:proofErr w:type="gramStart"/>
       <w:r>
-        <w:t>setImmediate(</w:t>
-      </w:r>
-      <w:proofErr w:type="gramEnd"/>
-      <w:r>
-        <w:t xml:space="preserve">). </w:t>
-      </w:r>
-      <w:proofErr w:type="gramStart"/>
-      <w:r>
-        <w:t>This yields</w:t>
-      </w:r>
-      <w:proofErr w:type="gramEnd"/>
-      <w:r>
-        <w:t xml:space="preserve"> control back to the event loop between chunks, allowing it to handle pending network requests.</w:t>
-      </w:r>
-    </w:p>
-    <w:p>
-      <w:r>
-        <w:t>javascript</w:t>
-      </w:r>
-    </w:p>
-    <w:p>
-      <w:r>
-        <w:t>// Blocks the loop completely</w:t>
-      </w:r>
-    </w:p>
-    <w:p>
-      <w:r>
-        <w:t>function blockLoop(</w:t>
-      </w:r>
-      <w:proofErr w:type="gramStart"/>
-      <w:r>
-        <w:t>array) {</w:t>
-      </w:r>
-      <w:proofErr w:type="gramEnd"/>
-    </w:p>
-    <w:p>
-      <w:r>
-        <w:t xml:space="preserve">  for (let item of </w:t>
-      </w:r>
-      <w:proofErr w:type="gramStart"/>
-      <w:r>
-        <w:t>array) {</w:t>
-      </w:r>
-      <w:proofErr w:type="gramEnd"/>
-    </w:p>
-    <w:p>
-      <w:r>
-        <w:t xml:space="preserve">    heavyCalculation(item); </w:t>
-      </w:r>
-    </w:p>
-    <w:p>
-      <w:r>
-        <w:t xml:space="preserve">  }</w:t>
-      </w:r>
-    </w:p>
-    <w:p>
-      <w:r>
-        <w:t>}</w:t>
-      </w:r>
-    </w:p>
-    <w:p/>
-    <w:p>
-      <w:r>
-        <w:t>// Non-blocking: Partitions work and yields control</w:t>
-      </w:r>
-    </w:p>
-    <w:p>
-      <w:r>
-        <w:t xml:space="preserve">function </w:t>
-      </w:r>
-      <w:proofErr w:type="gramStart"/>
-      <w:r>
-        <w:t>safeProcess(</w:t>
-      </w:r>
-      <w:proofErr w:type="gramEnd"/>
-      <w:r>
-        <w:t xml:space="preserve">array, index = </w:t>
-      </w:r>
-      <w:proofErr w:type="gramStart"/>
-      <w:r>
-        <w:t>0) {</w:t>
-      </w:r>
-      <w:proofErr w:type="gramEnd"/>
-    </w:p>
-    <w:p>
-      <w:r>
-        <w:t xml:space="preserve">  if (index &gt;= </w:t>
-      </w:r>
-      <w:proofErr w:type="gramStart"/>
-      <w:r>
-        <w:t>array.length</w:t>
-      </w:r>
-      <w:proofErr w:type="gramEnd"/>
-      <w:r>
-        <w:t>) return;</w:t>
-      </w:r>
-    </w:p>
-    <w:p/>
-    <w:p>
-      <w:r>
-        <w:t xml:space="preserve">  heavyCalculation(array[index]);</w:t>
-      </w:r>
-    </w:p>
-    <w:p/>
-    <w:p>
-      <w:r>
-        <w:t xml:space="preserve">  // Yields back to the event loop before processing the next item</w:t>
-      </w:r>
-    </w:p>
-    <w:p>
-      <w:r>
-        <w:t xml:space="preserve">  </w:t>
-      </w:r>
-      <w:proofErr w:type="gramStart"/>
-      <w:r>
-        <w:t>setImmediate(</w:t>
-      </w:r>
-      <w:proofErr w:type="gramEnd"/>
-      <w:r>
-        <w:t xml:space="preserve">() =&gt; </w:t>
-      </w:r>
-      <w:proofErr w:type="gramStart"/>
-      <w:r>
-        <w:t>safeProcess(</w:t>
-      </w:r>
-      <w:proofErr w:type="gramEnd"/>
-      <w:r>
-        <w:t>array, index + 1));</w:t>
-      </w:r>
-    </w:p>
-    <w:p>
-      <w:r>
-        <w:t>}</w:t>
-      </w:r>
-    </w:p>
-    <w:p>
-      <w:r>
-        <w:t>Use code with caution.</w:t>
-      </w:r>
-    </w:p>
-    <w:p>
-      <w:pPr>
-        <w:rPr>
-          <w:b/>
-          <w:bCs/>
-        </w:rPr>
-      </w:pPr>
-      <w:r>
-        <w:rPr>
-          <w:b/>
-          <w:bCs/>
-        </w:rPr>
-        <w:lastRenderedPageBreak/>
-        <w:t>3. Use Worker Threads</w:t>
-      </w:r>
-    </w:p>
-    <w:p>
-      <w:r>
-        <w:t>For heavy CPU mathematics or data analysis, spawn real background threads using the worker_threads module to execute tasks on separate CPU cores.</w:t>
-      </w:r>
-    </w:p>
-    <w:p>
-      <w:r>
-        <w:t xml:space="preserve">Would you like to look at a </w:t>
-      </w:r>
-      <w:r>
-        <w:rPr>
-          <w:b/>
-          <w:bCs/>
-        </w:rPr>
-        <w:t>code snippet quiz</w:t>
-      </w:r>
-      <w:r>
-        <w:t xml:space="preserve"> to test your knowledge on the exact print order of setTimeout, setImmediate, and </w:t>
-      </w:r>
-      <w:proofErr w:type="gramStart"/>
-      <w:r>
         <w:t>process.nextTick</w:t>
       </w:r>
+      <w:proofErr w:type="spellEnd"/>
       <w:proofErr w:type="gramEnd"/>
       <w:r>
         <w:t xml:space="preserve">, or see an </w:t>
@@ -3476,6 +3694,7 @@
   <w:style w:type="character" w:default="1" w:styleId="DefaultParagraphFont">
     <w:name w:val="Default Paragraph Font"/>
     <w:uiPriority w:val="1"/>
+    <w:semiHidden/>
     <w:unhideWhenUsed/>
   </w:style>
   <w:style w:type="table" w:default="1" w:styleId="TableNormal">

</xml_diff>